<commit_message>
docs: reorganize project documentation
</commit_message>
<xml_diff>
--- a/docs/generated/product-spec-evidence-report.docx
+++ b/docs/generated/product-spec-evidence-report.docx
@@ -28,12 +28,12 @@
         <w:pStyle w:val="Heading1"/>
       </w:pPr>
       <w:r>
-        <w:t xml:space="preserve">1. Cost-first automation</w:t>
-      </w:r>
-    </w:p>
-    <w:p>
-      <w:r>
-        <w:t xml:space="preserve">The registry is structured JSON and the generator performs local path/marker checks. This replaces a manually maintained or AI-maintained status inventory with a deterministic repository check. Validation is offline: the Arazzo 1.1 schema is vendored from the OpenAPI Initiative and AsyncAPI uses its official parser; no hosted validation service is called.</w:t>
+        <w:t xml:space="preserve">1. Deterministic automation</w:t>
+      </w:r>
+    </w:p>
+    <w:p>
+      <w:r>
+        <w:t xml:space="preserve">The registry is structured JSON and the generator performs local path/marker checks instead of trusting a manually copied status list. Validation is offline: the Arazzo 1.1 schema is vendored from the OpenAPI Initiative and AsyncAPI uses its official parser; no hosted validation service is called.</w:t>
       </w:r>
     </w:p>
     <w:p>
@@ -46,7 +46,7 @@
     </w:p>
     <w:p>
       <w:r>
-        <w:t xml:space="preserve">Current-status prose is consolidated in the registry. Product intent, architecture, and domain specifications remain separate because they answer different questions. The README links to this report instead of duplicating a stage snapshot. No domain specification was deleted without a clearly redundant replacement.</w:t>
+        <w:t xml:space="preserve">Code-backed status is consolidated in the registry. Product intent, architecture, domain specifications, roadmap triggers and operational evidence remain separate because they answer different questions. This report is a generated projection and never overrides those owners.</w:t>
       </w:r>
     </w:p>
     <w:p>
@@ -54,7 +54,7 @@
         <w:pStyle w:val="Heading1"/>
       </w:pPr>
       <w:r>
-        <w:t xml:space="preserve">3. Algorithm, database-query, and cache decisions</w:t>
+        <w:t xml:space="preserve">3. Decision boundaries</w:t>
       </w:r>
     </w:p>
     <w:p>
@@ -70,7 +70,7 @@
         <w:pStyle w:val="ListBullet"/>
       </w:pPr>
       <w:r>
-        <w:t xml:space="preserve">• No cache policy, query rewrite, CQRS split, or algorithm upgrade is claimed here without production measurements. The deferred items below name the missing evidence and owner.</w:t>
+        <w:t xml:space="preserve">• No provider readiness, cache policy, query rewrite, CQRS split, algorithm upgrade or production verification is inferred from source existence. Deferred items name the missing evidence and owner.</w:t>
       </w:r>
     </w:p>
     <w:p>
@@ -78,12 +78,12 @@
         <w:pStyle w:val="Heading1"/>
       </w:pPr>
       <w:r>
-        <w:t xml:space="preserve">4. Structure standardization</w:t>
-      </w:r>
-    </w:p>
-    <w:p>
-      <w:r>
-        <w:t xml:space="preserve">The canonical Nest rule is semantic: &lt;module&gt;.controller.ts is the primary HTTP facade, secondary HTTP resources belong in controllers/, and third-party inbound controllers remain in webhooks/. The matching invite and feed story controllers were moved to controllers/, and an architecture test now enforces this layout. 16-module-blueprint.md (../16-module-blueprint.md), 05-coding-standards.md (../05-coding-standards.md), and 11-engineering-principles.md (../11-engineering-principles.md) remain the structure rules.</w:t>
+        <w:t xml:space="preserve">4. Structure coverage</w:t>
+      </w:r>
+    </w:p>
+    <w:p>
+      <w:r>
+        <w:t xml:space="preserve">The service catalog names every top-level Core API module and links module-specific specifications where they exist. 16-module-blueprint.md (../16-module-blueprint.md), 05-coding-standards.md (../05-coding-standards.md), 11-engineering-principles.md (../11-engineering-principles.md) and architecture tests remain the structure rules; this report does not duplicate them.</w:t>
       </w:r>
     </w:p>
     <w:p>
@@ -131,7 +131,7 @@
         <w:pStyle w:val="ListBullet"/>
       </w:pPr>
       <w:r>
-        <w:t xml:space="preserve">• GitHub CI/CD: explicitly out of scope for this change.</w:t>
+        <w:t xml:space="preserve">• Operational and CI readiness: intentionally outside this feature registry; use the applicable runbook, workflow result and artifact/SHA.</w:t>
       </w:r>
     </w:p>
     <w:p>
@@ -155,7 +155,7 @@
         <w:pStyle w:val="TableCell"/>
       </w:pPr>
       <w:r>
-        <w:t xml:space="preserve">Feature: Guest, OTP, social login and rotating browser sessions</w:t>
+        <w:t xml:space="preserve">Feature: Guest, OTP, social login, identity upgrade and rotating browser sessions</w:t>
       </w:r>
     </w:p>
     <w:p>
@@ -179,6 +179,38 @@
         <w:pStyle w:val="TableCardTitle"/>
       </w:pPr>
       <w:r>
+        <w:t xml:space="preserve">runtime-capabilities</w:t>
+      </w:r>
+    </w:p>
+    <w:p>
+      <w:pPr>
+        <w:pStyle w:val="TableCell"/>
+      </w:pPr>
+      <w:r>
+        <w:t xml:space="preserve">Feature: Server-derived runtime availability contract for frontend providers</w:t>
+      </w:r>
+    </w:p>
+    <w:p>
+      <w:pPr>
+        <w:pStyle w:val="TableCell"/>
+      </w:pPr>
+      <w:r>
+        <w:t xml:space="preserve">Owner: core-api/app with admin/web consumers</w:t>
+      </w:r>
+    </w:p>
+    <w:p>
+      <w:pPr>
+        <w:pStyle w:val="TableCell"/>
+      </w:pPr>
+      <w:r>
+        <w:t xml:space="preserve">Verification evidence: automated-test-source</w:t>
+      </w:r>
+    </w:p>
+    <w:p>
+      <w:pPr>
+        <w:pStyle w:val="TableCardTitle"/>
+      </w:pPr>
+      <w:r>
         <w:t xml:space="preserve">economy-ledger</w:t>
       </w:r>
     </w:p>
@@ -219,7 +251,7 @@
         <w:pStyle w:val="TableCell"/>
       </w:pPr>
       <w:r>
-        <w:t xml:space="preserve">Feature: Queue ticket, pairing and paid speed-up</w:t>
+        <w:t xml:space="preserve">Feature: Queue ticket, pairing, guest quota and paid speed-up</w:t>
       </w:r>
     </w:p>
     <w:p>
@@ -731,7 +763,7 @@
         <w:pStyle w:val="TableCell"/>
       </w:pPr>
       <w:r>
-        <w:t xml:space="preserve">Feature: Auto-enabled hosted analytics and explicit unmasked replay behavior</w:t>
+        <w:t xml:space="preserve">Feature: Consent-gated hosted analytics with autocapture and session replay disabled</w:t>
       </w:r>
     </w:p>
     <w:p>
@@ -763,7 +795,7 @@
         <w:pStyle w:val="TableCell"/>
       </w:pPr>
       <w:r>
-        <w:t xml:space="preserve">Feature: Authenticated Socket.IO user fanout through Redis</w:t>
+        <w:t xml:space="preserve">Feature: Authenticated Socket.IO fanout and distributed connection quota through Redis</w:t>
       </w:r>
     </w:p>
     <w:p>
@@ -795,7 +827,7 @@
         <w:pStyle w:val="Heading2"/>
       </w:pPr>
       <w:r>
-        <w:t xml:space="preserve">Guest, OTP, social login and rotating browser sessions</w:t>
+        <w:t xml:space="preserve">Guest, OTP, social login, identity upgrade and rotating browser sessions</w:t>
       </w:r>
     </w:p>
     <w:p>
@@ -827,15 +859,63 @@
         <w:pStyle w:val="ListBullet"/>
       </w:pPr>
       <w:r>
-        <w:t xml:space="preserve">• Implementation evidence: apps/core-api/src/modules/auth/auth.controller.ts:39 — contains @Controller('auth')</w:t>
-      </w:r>
-    </w:p>
-    <w:p>
-      <w:pPr>
-        <w:pStyle w:val="ListBullet"/>
-      </w:pPr>
-      <w:r>
-        <w:t xml:space="preserve">• Verification evidence (automated-test-source): apps/core-api/src/modules/auth/auth.service.spec.ts:7 — contains AuthService</w:t>
+        <w:t xml:space="preserve">• Implementation evidence: apps/core-api/src/modules/auth/auth.controller.ts:39 — contains @Controller('auth'); apps/core-api/src/modules/auth/controllers/auth-upgrade.controller.ts:32 — contains @Controller('auth/upgrade')</w:t>
+      </w:r>
+    </w:p>
+    <w:p>
+      <w:pPr>
+        <w:pStyle w:val="ListBullet"/>
+      </w:pPr>
+      <w:r>
+        <w:t xml:space="preserve">• Verification evidence (automated-test-source): apps/core-api/src/modules/auth/auth.service.spec.ts:168 — contains social upgrade giữ userId</w:t>
+      </w:r>
+    </w:p>
+    <w:p>
+      <w:pPr>
+        <w:pStyle w:val="Heading2"/>
+      </w:pPr>
+      <w:r>
+        <w:t xml:space="preserve">Server-derived runtime availability contract for frontend providers</w:t>
+      </w:r>
+    </w:p>
+    <w:p>
+      <w:pPr>
+        <w:pStyle w:val="ListBullet"/>
+      </w:pPr>
+      <w:r>
+        <w:t xml:space="preserve">• Status: implemented</w:t>
+      </w:r>
+    </w:p>
+    <w:p>
+      <w:pPr>
+        <w:pStyle w:val="ListBullet"/>
+      </w:pPr>
+      <w:r>
+        <w:t xml:space="preserve">• Owner: core-api/app with admin/web consumers</w:t>
+      </w:r>
+    </w:p>
+    <w:p>
+      <w:pPr>
+        <w:pStyle w:val="ListBullet"/>
+      </w:pPr>
+      <w:r>
+        <w:t xml:space="preserve">• Contracts: openapi/core-api.json, docs/12-frontend-architecture.md, .env.example</w:t>
+      </w:r>
+    </w:p>
+    <w:p>
+      <w:pPr>
+        <w:pStyle w:val="ListBullet"/>
+      </w:pPr>
+      <w:r>
+        <w:t xml:space="preserve">• Implementation evidence: apps/core-api/src/app/capabilities.controller.ts:10 — contains @Controller('capabilities'); apps/core-api/src/app/capabilities.service.ts:29 — contains getCapabilities(): CapabilitiesDto</w:t>
+      </w:r>
+    </w:p>
+    <w:p>
+      <w:pPr>
+        <w:pStyle w:val="ListBullet"/>
+      </w:pPr>
+      <w:r>
+        <w:t xml:space="preserve">• Verification evidence (automated-test-source): apps/core-api/src/app/capabilities.service.spec.ts:35 — contains derives configured providers; apps/web/src/shared/capabilities/api.spec.tsx:9 — contains capabilities</w:t>
       </w:r>
     </w:p>
     <w:p>
@@ -875,7 +955,7 @@
         <w:pStyle w:val="ListBullet"/>
       </w:pPr>
       <w:r>
-        <w:t xml:space="preserve">• Implementation evidence: apps/core-api/src/modules/economy/economy.controller.ts:39 — contains @Controller('economy'); apps/core-api/src/modules/economy/services/ledger.service.ts:73 — contains LedgerService</w:t>
+        <w:t xml:space="preserve">• Implementation evidence: apps/core-api/src/modules/economy/economy.controller.ts:48 — contains @Controller('economy'); apps/core-api/src/modules/economy/services/ledger.service.ts:73 — contains LedgerService</w:t>
       </w:r>
     </w:p>
     <w:p>
@@ -891,7 +971,7 @@
         <w:pStyle w:val="Heading2"/>
       </w:pPr>
       <w:r>
-        <w:t xml:space="preserve">Queue ticket, pairing and paid speed-up</w:t>
+        <w:t xml:space="preserve">Queue ticket, pairing, guest quota and paid speed-up</w:t>
       </w:r>
     </w:p>
     <w:p>
@@ -923,15 +1003,15 @@
         <w:pStyle w:val="ListBullet"/>
       </w:pPr>
       <w:r>
-        <w:t xml:space="preserve">• Implementation evidence: apps/core-api/src/modules/matching/matching.controller.ts:38 — contains @Controller('matching'); apps/core-api/src/modules/matching/jobs/matcher-worker.service.ts:71 — contains MatcherWorkerService</w:t>
-      </w:r>
-    </w:p>
-    <w:p>
-      <w:pPr>
-        <w:pStyle w:val="ListBullet"/>
-      </w:pPr>
-      <w:r>
-        <w:t xml:space="preserve">• Verification evidence (automated-test-source): apps/core-api/src/modules/matching/matching.integration.spec.ts:11 — contains Matching</w:t>
+        <w:t xml:space="preserve">• Implementation evidence: apps/core-api/src/modules/matching/matching.controller.ts:42 — contains @Controller('matching'); apps/core-api/src/modules/matching/jobs/matcher-worker.service.ts:71 — contains MatcherWorkerService; apps/core-api/src/modules/matching/services/guest-match-quota.service.ts:27 — contains GuestMatchQuotaService</w:t>
+      </w:r>
+    </w:p>
+    <w:p>
+      <w:pPr>
+        <w:pStyle w:val="ListBullet"/>
+      </w:pPr>
+      <w:r>
+        <w:t xml:space="preserve">• Verification evidence (automated-test-source): apps/core-api/src/modules/matching/matching.integration.spec.ts:436 — contains guest quota: concurrent guest mới cùng IP</w:t>
       </w:r>
     </w:p>
     <w:p>
@@ -1659,7 +1739,7 @@
         <w:pStyle w:val="Heading2"/>
       </w:pPr>
       <w:r>
-        <w:t xml:space="preserve">Auto-enabled hosted analytics and explicit unmasked replay behavior</w:t>
+        <w:t xml:space="preserve">Consent-gated hosted analytics with autocapture and session replay disabled</w:t>
       </w:r>
     </w:p>
     <w:p>
@@ -1691,23 +1771,23 @@
         <w:pStyle w:val="ListBullet"/>
       </w:pPr>
       <w:r>
-        <w:t xml:space="preserve">• Implementation evidence: apps/web/src/shared/analytics/product-analytics.ts:63 — contains posthog.optincapturing();; apps/web/src/shared/analytics/product-analytics.ts:58 — contains maskAllInputs: false; apps/web/src/shared/analytics/product-analytics.ts:53 — contains autocapture: true; apps/web/src/shared/analytics/product-analytics-components.tsx:26 — contains Analytics luôn bật khi đã cấu hình PostHog.</w:t>
-      </w:r>
-    </w:p>
-    <w:p>
-      <w:pPr>
-        <w:pStyle w:val="ListBullet"/>
-      </w:pPr>
-      <w:r>
-        <w:t xml:space="preserve">• Verification evidence (automated-test-source): apps/web/src/shared/analytics/product-analytics.spec.ts:42 — contains khởi tạo SDK ngay cả khi chưa có cookie consent; apps/web/src/shared/analytics/product-analytics.spec.ts:47 — contains bật autocapture và không che text/input của session replay; apps/web/src/shared/analytics/product-analytics-components.spec.tsx:23 — contains hiển thị analytics đang bật và không có thao tác opt-in riêng</w:t>
-      </w:r>
-    </w:p>
-    <w:p>
-      <w:pPr>
-        <w:pStyle w:val="Heading2"/>
-      </w:pPr>
-      <w:r>
-        <w:t xml:space="preserve">Authenticated Socket.IO user fanout through Redis</w:t>
+        <w:t xml:space="preserve">• Implementation evidence: apps/web/src/shared/analytics/product-analytics.ts:37 — contains posthog.optincapturing({ captureEventName: false });; apps/web/src/shared/analytics/product-analytics.ts:75 — contains maskAllInputs: true; apps/web/src/shared/analytics/product-analytics.ts:69 — contains autocapture: false; apps/web/src/shared/analytics/product-analytics-components.tsx:63 — contains setProductAnalyticsConsent(enabled ? 'declined' : 'accepted')</w:t>
+      </w:r>
+    </w:p>
+    <w:p>
+      <w:pPr>
+        <w:pStyle w:val="ListBullet"/>
+      </w:pPr>
+      <w:r>
+        <w:t xml:space="preserve">• Verification evidence (automated-test-source): apps/web/src/shared/analytics/product-analytics.spec.ts:46 — contains không khởi tạo hoặc opt-in khi; apps/web/src/shared/analytics/product-analytics.spec.ts:56 — contains tắt autocapture/session replay; apps/web/src/shared/analytics/product-analytics-components.spec.tsx:52 — contains mặc định tắt, cho phép accept rồi decline lại</w:t>
+      </w:r>
+    </w:p>
+    <w:p>
+      <w:pPr>
+        <w:pStyle w:val="Heading2"/>
+      </w:pPr>
+      <w:r>
+        <w:t xml:space="preserve">Authenticated Socket.IO fanout and distributed connection quota through Redis</w:t>
       </w:r>
     </w:p>
     <w:p>
@@ -1739,15 +1819,15 @@
         <w:pStyle w:val="ListBullet"/>
       </w:pPr>
       <w:r>
-        <w:t xml:space="preserve">• Implementation evidence: apps/signaling-gateway/src/app/signaling.gateway.ts:42 — contains @WebSocketGateway; libs/common-dtos/src/lib/realtime-events.ts:34 — contains export const RealtimeEvents</w:t>
-      </w:r>
-    </w:p>
-    <w:p>
-      <w:pPr>
-        <w:pStyle w:val="ListBullet"/>
-      </w:pPr>
-      <w:r>
-        <w:t xml:space="preserve">• Verification evidence (automated-test-source): apps/signaling-gateway/src/app/signaling.integration.spec.ts:109 — contains event chỉ tới ĐÚNG user</w:t>
+        <w:t xml:space="preserve">• Implementation evidence: apps/signaling-gateway/src/app/signaling.gateway.ts:45 — contains @WebSocketGateway; libs/common-dtos/src/lib/realtime-events.ts:34 — contains export const RealtimeEvents; apps/signaling-gateway/src/app/connection-quota.service.ts:55 — contains ConnectionQuotaService</w:t>
+      </w:r>
+    </w:p>
+    <w:p>
+      <w:pPr>
+        <w:pStyle w:val="ListBullet"/>
+      </w:pPr>
+      <w:r>
+        <w:t xml:space="preserve">• Verification evidence (automated-test-source): apps/signaling-gateway/src/app/signaling.integration.spec.ts:109 — contains event chỉ tới ĐÚNG user; apps/signaling-gateway/src/app/signaling.horizontal-scale.integration.spec.ts:175 — contains quota per-user atomic xuyên 2 instance</w:t>
       </w:r>
     </w:p>
     <w:p>
@@ -1827,7 +1907,7 @@
         <w:pStyle w:val="ListBullet"/>
       </w:pPr>
       <w:r>
-        <w:t xml:space="preserve">• Source evidence: apps/core-api/src/arch/module-layout.spec.ts:36 — contains chỉ để HTTP facade chính ở root; apps/core-api/src/modules/matching/controllers/invite.controller.spec.ts:1 — contains InviteController</w:t>
+        <w:t xml:space="preserve">• Source evidence: apps/core-api/src/arch/module-layout.spec.ts:76 — contains chỉ để HTTP facade chính ở root; apps/core-api/src/modules/matching/controllers/invite.controller.spec.ts:1 — contains InviteController</w:t>
       </w:r>
     </w:p>
     <w:p>
@@ -1987,7 +2067,7 @@
         <w:pStyle w:val="ListBullet"/>
       </w:pPr>
       <w:r>
-        <w:t xml:space="preserve">• Source evidence: package.json:37 — contains "agent:check":; scripts/agent/verify.mjs:20 — contains requiredTargets: ['lint', 'test', 'build']</w:t>
+        <w:t xml:space="preserve">• Source evidence: package.json:39 — contains "agent:check":; scripts/agent/verify.mjs:20 — contains requiredTargets: ['lint', 'test', 'build']</w:t>
       </w:r>
     </w:p>
     <w:p>
@@ -2051,7 +2131,7 @@
         <w:pStyle w:val="TableCell"/>
       </w:pPr>
       <w:r>
-        <w:t xml:space="preserve">Guard location: apps/core-api/src/app/app.module.ts:108 — contains { provide: APP_GUARD, useClass: JwtAuthGuard }; apps/core-api/src/modules/short-video/short-video.controller.ts:129 — contains await this.videoService.reportVideo(user, id, dto.reason, dto.description);</w:t>
+        <w:t xml:space="preserve">Guard location: apps/core-api/src/app/app.module.ts:111 — contains { provide: APP_GUARD, useClass: JwtAuthGuard }; apps/core-api/src/modules/short-video/short-video.controller.ts:129 — contains await this.videoService.reportVideo(user, id, dto.reason, dto.description);</w:t>
       </w:r>
     </w:p>
     <w:p>
@@ -2341,7 +2421,7 @@
         <w:pStyle w:val="ListBullet"/>
       </w:pPr>
       <w:r>
-        <w:t xml:space="preserve">• Evidence: docs/07-roadmap.md:180 — contains số liệu traffic production thật</w:t>
+        <w:t xml:space="preserve">• Evidence: docs/07-roadmap.md:99 — contains số liệu traffic production thật</w:t>
       </w:r>
     </w:p>
     <w:p>
@@ -2382,14 +2462,6 @@
       </w:pPr>
       <w:r>
         <w:t xml:space="preserve">Out of scope</w:t>
-      </w:r>
-    </w:p>
-    <w:p>
-      <w:pPr>
-        <w:pStyle w:val="ListBullet"/>
-      </w:pPr>
-      <w:r>
-        <w:t xml:space="preserve">• github-ci-cd — The audit explicitly excludes GitHub CI/CD. This change does not edit .github, CI workflows, deployment manifests or release automation.</w:t>
       </w:r>
     </w:p>
     <w:sectPr>

</xml_diff>

<commit_message>
feat(display-info): turn on display info
- BE: add API endpoints and data structure for display info
- Web: render display info component and integrate with API
</commit_message>
<xml_diff>
--- a/docs/generated/product-spec-evidence-report.docx
+++ b/docs/generated/product-spec-evidence-report.docx
@@ -1723,7 +1723,7 @@
         <w:pStyle w:val="ListBullet"/>
       </w:pPr>
       <w:r>
-        <w:t xml:space="preserve">• Implementation evidence: apps/core-api/src/modules/user/user.service.ts:398 — contains Ngày sinh là dữ liệu profile tự chọn; apps/core-api/src/modules/user/dto/update-profile.dto.ts:40 — contains không cho ngày trong tương lai</w:t>
+        <w:t xml:space="preserve">• Implementation evidence: apps/core-api/src/modules/user/user.service.ts:404 — contains Ngày sinh là dữ liệu profile tự chọn; apps/core-api/src/modules/user/dto/update-profile.dto.ts:40 — contains không cho ngày trong tương lai</w:t>
       </w:r>
     </w:p>
     <w:p>
@@ -1819,7 +1819,7 @@
         <w:pStyle w:val="ListBullet"/>
       </w:pPr>
       <w:r>
-        <w:t xml:space="preserve">• Implementation evidence: apps/signaling-gateway/src/app/signaling.gateway.ts:45 — contains @WebSocketGateway; libs/common-dtos/src/lib/realtime-events.ts:34 — contains export const RealtimeEvents; apps/signaling-gateway/src/app/connection-quota.service.ts:55 — contains ConnectionQuotaService</w:t>
+        <w:t xml:space="preserve">• Implementation evidence: apps/signaling-gateway/src/app/signaling.gateway.ts:45 — contains @WebSocketGateway; libs/common-dtos/src/lib/realtime-events.ts:34 — contains export const RealtimeEvents; apps/signaling-gateway/src/app/connection-quota.service.ts:66 — contains ConnectionQuotaService</w:t>
       </w:r>
     </w:p>
     <w:p>

</xml_diff>

<commit_message>
refactor(platform): isolate push and analytics adapters
</commit_message>
<xml_diff>
--- a/docs/generated/product-spec-evidence-report.docx
+++ b/docs/generated/product-spec-evidence-report.docx
@@ -539,7 +539,7 @@
         <w:pStyle w:val="TableCell"/>
       </w:pPr>
       <w:r>
-        <w:t xml:space="preserve">Feature: In-process notification dispatch and development push provider</w:t>
+        <w:t xml:space="preserve">Feature: In-process notification dispatch with isolated push and analytics adapters</w:t>
       </w:r>
     </w:p>
     <w:p>
@@ -867,7 +867,7 @@
         <w:pStyle w:val="ListBullet"/>
       </w:pPr>
       <w:r>
-        <w:t xml:space="preserve">• Verification evidence (automated-test-source): apps/core-api/src/modules/auth/auth.service.spec.ts:168 — contains social upgrade giữ userId</w:t>
+        <w:t xml:space="preserve">• Verification evidence (automated-test-source): apps/core-api/src/modules/auth/auth.service.spec.ts:171 — contains social upgrade giữ userId</w:t>
       </w:r>
     </w:p>
     <w:p>
@@ -1147,7 +1147,7 @@
         <w:pStyle w:val="ListBullet"/>
       </w:pPr>
       <w:r>
-        <w:t xml:space="preserve">• Implementation evidence: apps/core-api/src/modules/party-room/party-room.controller.ts:37 — contains @Controller('party/rooms')</w:t>
+        <w:t xml:space="preserve">• Implementation evidence: apps/core-api/src/modules/party-room/party-room.controller.ts:46 — contains @Controller('party/rooms')</w:t>
       </w:r>
     </w:p>
     <w:p>
@@ -1243,7 +1243,7 @@
         <w:pStyle w:val="ListBullet"/>
       </w:pPr>
       <w:r>
-        <w:t xml:space="preserve">• Implementation evidence: apps/core-api/src/modules/friend/friend.controller.ts:45 — contains export class FriendController; apps/core-api/src/modules/friend/services/streak.service.ts:38 — contains StreakService</w:t>
+        <w:t xml:space="preserve">• Implementation evidence: apps/core-api/src/modules/friend/friend.controller.ts:46 — contains export class FriendController; apps/core-api/src/modules/friend/services/streak.service.ts:38 — contains StreakService</w:t>
       </w:r>
     </w:p>
     <w:p>
@@ -1291,7 +1291,7 @@
         <w:pStyle w:val="ListBullet"/>
       </w:pPr>
       <w:r>
-        <w:t xml:space="preserve">• Implementation evidence: apps/core-api/src/modules/feed/feed.controller.ts:44 — contains @Controller('feed'); apps/core-api/src/modules/feed/controllers/story.controller.ts:37 — contains @Controller('stories')</w:t>
+        <w:t xml:space="preserve">• Implementation evidence: apps/core-api/src/modules/feed/feed.controller.ts:45 — contains @Controller('feed'); apps/core-api/src/modules/feed/controllers/story.controller.ts:38 — contains @Controller('stories')</w:t>
       </w:r>
     </w:p>
     <w:p>
@@ -1403,7 +1403,7 @@
         <w:pStyle w:val="Heading2"/>
       </w:pPr>
       <w:r>
-        <w:t xml:space="preserve">In-process notification dispatch and development push provider</w:t>
+        <w:t xml:space="preserve">In-process notification dispatch with isolated push and analytics adapters</w:t>
       </w:r>
     </w:p>
     <w:p>
@@ -1443,7 +1443,7 @@
         <w:pStyle w:val="ListBullet"/>
       </w:pPr>
       <w:r>
-        <w:t xml:space="preserve">• Verification evidence (automated-test-source): apps/core-api/src/modules/notification/notification.service.spec.ts:3 — contains NotificationService</w:t>
+        <w:t xml:space="preserve">• Verification evidence (automated-test-source): apps/core-api/src/modules/notification/notification.service.spec.ts:3 — contains NotificationService; apps/core-api/src/common/platform/platform.adapters.spec.ts:34 — contains disabled feature/provider selects no-op adapters</w:t>
       </w:r>
     </w:p>
     <w:p>
@@ -1947,7 +1947,7 @@
         <w:pStyle w:val="ListBullet"/>
       </w:pPr>
       <w:r>
-        <w:t xml:space="preserve">• Source evidence: apps/core-api/src/modules/short-video/short-video.service.spec.ts:410 — contains vượt ngưỡng distinct reporter; apps/core-api/src/modules/short-video/short-video.integration.spec.ts:348 — contains cùng 1 người report lặp lại 1 video</w:t>
+        <w:t xml:space="preserve">• Source evidence: apps/core-api/src/modules/short-video/short-video.service.spec.ts:438 — contains vượt ngưỡng distinct reporter; apps/core-api/src/modules/short-video/short-video.integration.spec.ts:353 — contains cùng 1 người report lặp lại 1 video</w:t>
       </w:r>
     </w:p>
     <w:p>
@@ -2131,7 +2131,7 @@
         <w:pStyle w:val="TableCell"/>
       </w:pPr>
       <w:r>
-        <w:t xml:space="preserve">Guard location: apps/core-api/src/app/app.module.ts:111 — contains { provide: APP_GUARD, useClass: JwtAuthGuard }; apps/core-api/src/modules/short-video/short-video.controller.ts:129 — contains await this.videoService.reportVideo(user, id, dto.reason, dto.description);</w:t>
+        <w:t xml:space="preserve">Guard location: apps/core-api/src/app/app.module.ts:115 — contains { provide: APP_GUARD, useClass: JwtAuthGuard }; apps/core-api/src/modules/short-video/short-video.controller.ts:129 — contains await this.videoService.reportVideo(user, id, dto.reason, dto.description);</w:t>
       </w:r>
     </w:p>
     <w:p>
@@ -2171,7 +2171,7 @@
         <w:pStyle w:val="TableCell"/>
       </w:pPr>
       <w:r>
-        <w:t xml:space="preserve">Guard location: apps/core-api/src/modules/short-video/short-video.service.ts:481 — contains Chốt target tồn tại/visible trước khi ghi report; apps/core-api/src/modules/short-video/short-video.service.spec.ts:402 — contains validate video tồn tại trước khi gọi Safety</w:t>
+        <w:t xml:space="preserve">Guard location: apps/core-api/src/modules/short-video/short-video.service.ts:481 — contains Chốt target tồn tại/visible trước khi ghi report; apps/core-api/src/modules/short-video/short-video.service.spec.ts:430 — contains validate video tồn tại trước khi gọi Safety</w:t>
       </w:r>
     </w:p>
     <w:p>
@@ -2291,7 +2291,7 @@
         <w:pStyle w:val="TableCell"/>
       </w:pPr>
       <w:r>
-        <w:t xml:space="preserve">Guard location: apps/core-api/src/modules/safety/safety.service.ts:159 — contains trustPenaltyApplied: 0; apps/core-api/src/modules/short-video/short-video.integration.spec.ts:313 — contains report vượt VIDEOREPORTAUTOHIDE_THRESHOLD</w:t>
+        <w:t xml:space="preserve">Guard location: apps/core-api/src/modules/safety/safety.service.ts:159 — contains trustPenaltyApplied: 0; apps/core-api/src/modules/short-video/short-video.integration.spec.ts:318 — contains report vượt VIDEOREPORTAUTOHIDE_THRESHOLD</w:t>
       </w:r>
     </w:p>
     <w:p>

</xml_diff>

<commit_message>
fix(matching): complete Redis capability boundary
</commit_message>
<xml_diff>
--- a/docs/generated/product-spec-evidence-report.docx
+++ b/docs/generated/product-spec-evidence-report.docx
@@ -955,7 +955,7 @@
         <w:pStyle w:val="ListBullet"/>
       </w:pPr>
       <w:r>
-        <w:t xml:space="preserve">• Implementation evidence: apps/core-api/src/modules/economy/economy.controller.ts:48 — contains @Controller('economy'); apps/core-api/src/modules/economy/services/ledger.service.ts:73 — contains LedgerService</w:t>
+        <w:t xml:space="preserve">• Implementation evidence: apps/core-api/src/modules/economy/economy.controller.ts:48 — contains @Controller('economy'); apps/core-api/src/modules/economy/services/ledger.service.ts:48 — contains LedgerService</w:t>
       </w:r>
     </w:p>
     <w:p>
@@ -1003,15 +1003,15 @@
         <w:pStyle w:val="ListBullet"/>
       </w:pPr>
       <w:r>
-        <w:t xml:space="preserve">• Implementation evidence: apps/core-api/src/modules/matching/matching.controller.ts:42 — contains @Controller('matching'); apps/core-api/src/modules/matching/jobs/matcher-worker.service.ts:71 — contains MatcherWorkerService; apps/core-api/src/modules/matching/services/guest-match-quota.service.ts:27 — contains GuestMatchQuotaService</w:t>
-      </w:r>
-    </w:p>
-    <w:p>
-      <w:pPr>
-        <w:pStyle w:val="ListBullet"/>
-      </w:pPr>
-      <w:r>
-        <w:t xml:space="preserve">• Verification evidence (automated-test-source): apps/core-api/src/modules/matching/matching.integration.spec.ts:436 — contains guest quota: concurrent guest mới cùng IP</w:t>
+        <w:t xml:space="preserve">• Implementation evidence: apps/core-api/src/modules/matching/matching.controller.ts:42 — contains @Controller('matching'); apps/core-api/src/modules/matching/jobs/matcher-worker.service.ts:72 — contains MatcherWorkerService; apps/core-api/src/modules/matching/services/guest-match-quota.service.ts:27 — contains GuestMatchQuotaService</w:t>
+      </w:r>
+    </w:p>
+    <w:p>
+      <w:pPr>
+        <w:pStyle w:val="ListBullet"/>
+      </w:pPr>
+      <w:r>
+        <w:t xml:space="preserve">• Verification evidence (automated-test-source): apps/core-api/src/modules/matching/matching.integration.spec.ts:457 — contains guest quota: concurrent guest mới cùng IP</w:t>
       </w:r>
     </w:p>
     <w:p>
@@ -1059,7 +1059,7 @@
         <w:pStyle w:val="ListBullet"/>
       </w:pPr>
       <w:r>
-        <w:t xml:space="preserve">• Verification evidence (automated-test-source): apps/core-api/src/modules/soul-match/soul-match.integration.spec.ts:11 — contains Soul</w:t>
+        <w:t xml:space="preserve">• Verification evidence (automated-test-source): apps/core-api/src/modules/soul-match/soul-match.integration.spec.ts:12 — contains Soul</w:t>
       </w:r>
     </w:p>
     <w:p>
@@ -1107,7 +1107,7 @@
         <w:pStyle w:val="ListBullet"/>
       </w:pPr>
       <w:r>
-        <w:t xml:space="preserve">• Verification evidence (automated-test-source): apps/core-api/src/modules/calling/calling.integration.spec.ts:13 — contains Calling</w:t>
+        <w:t xml:space="preserve">• Verification evidence (automated-test-source): apps/core-api/src/modules/calling/calling.integration.spec.ts:14 — contains Calling</w:t>
       </w:r>
     </w:p>
     <w:p>
@@ -1155,7 +1155,7 @@
         <w:pStyle w:val="ListBullet"/>
       </w:pPr>
       <w:r>
-        <w:t xml:space="preserve">• Verification evidence (automated-test-source): apps/core-api/src/modules/party-room/party-room.integration.spec.ts:14 — contains Party</w:t>
+        <w:t xml:space="preserve">• Verification evidence (automated-test-source): apps/core-api/src/modules/party-room/party-room.integration.spec.ts:15 — contains Party</w:t>
       </w:r>
     </w:p>
     <w:p>
@@ -1203,7 +1203,7 @@
         <w:pStyle w:val="ListBullet"/>
       </w:pPr>
       <w:r>
-        <w:t xml:space="preserve">• Verification evidence (automated-test-source): apps/core-api/src/modules/gift/gift.integration.spec.ts:15 — contains Gift</w:t>
+        <w:t xml:space="preserve">• Verification evidence (automated-test-source): apps/core-api/src/modules/gift/gift.integration.spec.ts:16 — contains Gift</w:t>
       </w:r>
     </w:p>
     <w:p>
@@ -1395,7 +1395,7 @@
         <w:pStyle w:val="ListBullet"/>
       </w:pPr>
       <w:r>
-        <w:t xml:space="preserve">• Verification evidence (automated-test-source): apps/core-api/src/modules/avatar/avatar.integration.spec.ts:10 — contains Avatar; apps/core-api/src/modules/discovery/discovery.integration.spec.ts:13 — contains Discovery; apps/core-api/src/modules/mood/mood.integration.spec.ts:12 — contains Mood</w:t>
+        <w:t xml:space="preserve">• Verification evidence (automated-test-source): apps/core-api/src/modules/avatar/avatar.integration.spec.ts:11 — contains Avatar; apps/core-api/src/modules/discovery/discovery.integration.spec.ts:13 — contains Discovery; apps/core-api/src/modules/mood/mood.integration.spec.ts:12 — contains Mood</w:t>
       </w:r>
     </w:p>
     <w:p>
@@ -2131,7 +2131,7 @@
         <w:pStyle w:val="TableCell"/>
       </w:pPr>
       <w:r>
-        <w:t xml:space="preserve">Guard location: apps/core-api/src/app/app.module.ts:115 — contains { provide: APP_GUARD, useClass: JwtAuthGuard }; apps/core-api/src/modules/short-video/short-video.controller.ts:129 — contains await this.videoService.reportVideo(user, id, dto.reason, dto.description);</w:t>
+        <w:t xml:space="preserve">Guard location: apps/core-api/src/app/app.module.ts:117 — contains { provide: APP_GUARD, useClass: JwtAuthGuard }; apps/core-api/src/modules/short-video/short-video.controller.ts:129 — contains await this.videoService.reportVideo(user, id, dto.reason, dto.description);</w:t>
       </w:r>
     </w:p>
     <w:p>

</xml_diff>

<commit_message>
feat: add match quotas and friend voice calls
</commit_message>
<xml_diff>
--- a/docs/generated/product-spec-evidence-report.docx
+++ b/docs/generated/product-spec-evidence-report.docx
@@ -1003,15 +1003,15 @@
         <w:pStyle w:val="ListBullet"/>
       </w:pPr>
       <w:r>
-        <w:t xml:space="preserve">• Implementation evidence: apps/core-api/src/modules/matching/matching.controller.ts:42 — contains @Controller('matching'); apps/core-api/src/modules/matching/jobs/matcher-worker.service.ts:72 — contains MatcherWorkerService; apps/core-api/src/modules/matching/services/guest-match-quota.service.ts:27 — contains GuestMatchQuotaService</w:t>
-      </w:r>
-    </w:p>
-    <w:p>
-      <w:pPr>
-        <w:pStyle w:val="ListBullet"/>
-      </w:pPr>
-      <w:r>
-        <w:t xml:space="preserve">• Verification evidence (automated-test-source): apps/core-api/src/modules/matching/matching.integration.spec.ts:457 — contains guest quota: concurrent guest mới cùng IP</w:t>
+        <w:t xml:space="preserve">• Implementation evidence: apps/core-api/src/modules/matching/matching.controller.ts:42 — contains @Controller('matching'); apps/core-api/src/modules/matching/jobs/matcher-worker.service.ts:72 — contains MatcherWorkerService; apps/core-api/src/modules/matching/services/guest-match-quota.service.ts:37 — contains GuestMatchQuotaService</w:t>
+      </w:r>
+    </w:p>
+    <w:p>
+      <w:pPr>
+        <w:pStyle w:val="ListBullet"/>
+      </w:pPr>
+      <w:r>
+        <w:t xml:space="preserve">• Verification evidence (automated-test-source): apps/core-api/src/modules/matching/matching.integration.spec.ts:473 — contains guest quota: concurrent guest mới cùng IP</w:t>
       </w:r>
     </w:p>
     <w:p>

</xml_diff>